<commit_message>
v3 - MLOps: tests + CI, drift monitoring (PSI), MLflow tracking, Docker
- pytest suite (8) + ruff lint + GitHub Actions CI (ruff + pytest).
- PSI drift monitoring (src/pricing/monitoring.py, run_drift_report.py): ES 2016->2017.
- MLflow experiment tracking (sqlite backend) for GLM vs GBM.
- Dockerfile + .dockerignore for the Streamlit demo.
</commit_message>
<xml_diff>
--- a/docs/Documentacao_Pricing_Engine.docx
+++ b/docs/Documentacao_Pricing_Engine.docx
@@ -127,7 +127,7 @@
           </w:tcPr>
           <w:p>
             <w:r>
-              <w:t>0.2.0</w:t>
+              <w:t>0.3.0</w:t>
             </w:r>
           </w:p>
         </w:tc>
@@ -149,7 +149,7 @@
           </w:tcPr>
           <w:p>
             <w:r>
-              <w:t>2026-06-13</w:t>
+              <w:t>2026-06-29</w:t>
             </w:r>
           </w:p>
         </w:tc>
@@ -171,7 +171,7 @@
           </w:tcPr>
           <w:p>
             <w:r>
-              <w:t>v2 CONCLUIDA (elasticidade + otimizacao de premio na base ES; v1 completa)</w:t>
+              <w:t>v3 CONCLUIDA (MLOps: testes/CI, drift PSI, MLflow, Docker; v1+v2 completas)</w:t>
             </w:r>
           </w:p>
         </w:tc>
@@ -1533,7 +1533,7 @@
           </w:tcPr>
           <w:p>
             <w:r>
-              <w:t>Planejado</w:t>
+              <w:t>Concluida</w:t>
             </w:r>
           </w:p>
         </w:tc>
@@ -1617,6 +1617,46 @@
       </w:pPr>
       <w:r>
         <w:t>11. Historico de versoes (changelog)</w:t>
+      </w:r>
+    </w:p>
+    <w:p>
+      <w:pPr>
+        <w:pStyle w:val="Heading2"/>
+      </w:pPr>
+      <w:r>
+        <w:t>v0.3.0 - 2026-06-29</w:t>
+      </w:r>
+    </w:p>
+    <w:p>
+      <w:pPr>
+        <w:pStyle w:val="ListBullet"/>
+      </w:pPr>
+      <w:r>
+        <w:t>v3 MLOps: testes pytest (8) + lint ruff + CI no GitHub Actions.</w:t>
+      </w:r>
+    </w:p>
+    <w:p>
+      <w:pPr>
+        <w:pStyle w:val="ListBullet"/>
+      </w:pPr>
+      <w:r>
+        <w:t>Monitoramento de drift via PSI (src/pricing/monitoring.py, run_drift_report.py): ES 2016-&gt;2017 estavel.</w:t>
+      </w:r>
+    </w:p>
+    <w:p>
+      <w:pPr>
+        <w:pStyle w:val="ListBullet"/>
+      </w:pPr>
+      <w:r>
+        <w:t>MLflow tracking (backend sqlite) do experimento GLM vs GBM. Dockerfile da demo Streamlit.</w:t>
+      </w:r>
+    </w:p>
+    <w:p>
+      <w:pPr>
+        <w:pStyle w:val="ListBullet"/>
+      </w:pPr>
+      <w:r>
+        <w:t>Repositorio publicado no GitHub (MatPasquali/Insurance_Pricing_Engine).</w:t>
       </w:r>
     </w:p>
     <w:p>

</xml_diff>